<commit_message>
bai thuc hanh so 2
</commit_message>
<xml_diff>
--- a/HoTuanPhuoc_2224802010872_BT1.docx
+++ b/HoTuanPhuoc_2224802010872_BT1.docx
@@ -166,7 +166,7 @@
       </w:r>
       <w:r>
         <w:rPr>
-          <w:rStyle w:val="5"/>
+          <w:rStyle w:val="4"/>
           <w:rFonts w:hint="default" w:ascii="Times New Roman" w:hAnsi="Times New Roman" w:cs="Times New Roman"/>
           <w:b w:val="0"/>
           <w:bCs w:val="0"/>
@@ -408,6 +408,136 @@
           <w:lang w:val="en-US"/>
         </w:rPr>
         <w:t> ( Demo kết quả chạy)</w:t>
+      </w:r>
+    </w:p>
+    <w:p>
+      <w:pPr>
+        <w:rPr>
+          <w:rFonts w:hint="default" w:ascii="Times New Roman" w:hAnsi="Times New Roman" w:cs="Times New Roman"/>
+          <w:sz w:val="26"/>
+          <w:szCs w:val="26"/>
+          <w:lang w:val="en-US"/>
+        </w:rPr>
+      </w:pPr>
+      <w:r>
+        <w:rPr>
+          <w:rFonts w:hint="default" w:ascii="Times New Roman" w:hAnsi="Times New Roman" w:cs="Times New Roman"/>
+          <w:sz w:val="26"/>
+          <w:szCs w:val="26"/>
+          <w:lang w:val="en-US"/>
+        </w:rPr>
+        <w:t xml:space="preserve">Link source code: </w:t>
+      </w:r>
+      <w:r>
+        <w:rPr>
+          <w:rFonts w:hint="default" w:ascii="Times New Roman" w:hAnsi="Times New Roman" w:cs="Times New Roman"/>
+          <w:sz w:val="26"/>
+          <w:szCs w:val="26"/>
+          <w:lang w:val="en-US"/>
+        </w:rPr>
+        <w:fldChar w:fldCharType="begin"/>
+      </w:r>
+      <w:r>
+        <w:rPr>
+          <w:rFonts w:hint="default" w:ascii="Times New Roman" w:hAnsi="Times New Roman" w:cs="Times New Roman"/>
+          <w:sz w:val="26"/>
+          <w:szCs w:val="26"/>
+          <w:lang w:val="en-US"/>
+        </w:rPr>
+        <w:instrText xml:space="preserve"> HYPERLINK "https://github.com/hophuoc4so9/lab_flutter/tree/main/wikipediaDart" </w:instrText>
+      </w:r>
+      <w:r>
+        <w:rPr>
+          <w:rFonts w:hint="default" w:ascii="Times New Roman" w:hAnsi="Times New Roman" w:cs="Times New Roman"/>
+          <w:sz w:val="26"/>
+          <w:szCs w:val="26"/>
+          <w:lang w:val="en-US"/>
+        </w:rPr>
+        <w:fldChar w:fldCharType="separate"/>
+      </w:r>
+      <w:r>
+        <w:rPr>
+          <w:rStyle w:val="5"/>
+          <w:rFonts w:hint="default" w:ascii="Times New Roman" w:hAnsi="Times New Roman" w:cs="Times New Roman"/>
+          <w:sz w:val="26"/>
+          <w:szCs w:val="26"/>
+          <w:lang w:val="en-US"/>
+        </w:rPr>
+        <w:t>https://github.com/hophuoc4so9/lab_flutter/tree/main/wikipediaDart</w:t>
+      </w:r>
+      <w:r>
+        <w:rPr>
+          <w:rFonts w:hint="default" w:ascii="Times New Roman" w:hAnsi="Times New Roman" w:cs="Times New Roman"/>
+          <w:sz w:val="26"/>
+          <w:szCs w:val="26"/>
+          <w:lang w:val="en-US"/>
+        </w:rPr>
+        <w:fldChar w:fldCharType="end"/>
+      </w:r>
+    </w:p>
+    <w:p>
+      <w:pPr>
+        <w:rPr>
+          <w:rFonts w:hint="default" w:ascii="Times New Roman" w:hAnsi="Times New Roman" w:cs="Times New Roman"/>
+          <w:sz w:val="26"/>
+          <w:szCs w:val="26"/>
+          <w:lang w:val="en-US"/>
+        </w:rPr>
+      </w:pPr>
+      <w:r>
+        <w:rPr>
+          <w:rFonts w:hint="default" w:ascii="Times New Roman" w:hAnsi="Times New Roman" w:cs="Times New Roman"/>
+          <w:sz w:val="26"/>
+          <w:szCs w:val="26"/>
+          <w:lang w:val="en-US"/>
+        </w:rPr>
+        <w:t xml:space="preserve">Link video demo: </w:t>
+      </w:r>
+      <w:r>
+        <w:rPr>
+          <w:rFonts w:hint="default" w:ascii="Times New Roman" w:hAnsi="Times New Roman" w:cs="Times New Roman"/>
+          <w:sz w:val="26"/>
+          <w:szCs w:val="26"/>
+          <w:lang w:val="en-US"/>
+        </w:rPr>
+        <w:fldChar w:fldCharType="begin"/>
+      </w:r>
+      <w:r>
+        <w:rPr>
+          <w:rFonts w:hint="default" w:ascii="Times New Roman" w:hAnsi="Times New Roman" w:cs="Times New Roman"/>
+          <w:sz w:val="26"/>
+          <w:szCs w:val="26"/>
+          <w:lang w:val="en-US"/>
+        </w:rPr>
+        <w:instrText xml:space="preserve"> HYPERLINK "https://youtu.be/StcaH0eg0FY" </w:instrText>
+      </w:r>
+      <w:r>
+        <w:rPr>
+          <w:rFonts w:hint="default" w:ascii="Times New Roman" w:hAnsi="Times New Roman" w:cs="Times New Roman"/>
+          <w:sz w:val="26"/>
+          <w:szCs w:val="26"/>
+          <w:lang w:val="en-US"/>
+        </w:rPr>
+        <w:fldChar w:fldCharType="separate"/>
+      </w:r>
+      <w:r>
+        <w:rPr>
+          <w:rStyle w:val="5"/>
+          <w:rFonts w:hint="default" w:ascii="Times New Roman" w:hAnsi="Times New Roman" w:cs="Times New Roman"/>
+          <w:sz w:val="26"/>
+          <w:szCs w:val="26"/>
+          <w:lang w:val="en-US"/>
+        </w:rPr>
+        <w:t>https://youtu.be/StcaH0eg0FY</w:t>
+      </w:r>
+      <w:r>
+        <w:rPr>
+          <w:rFonts w:hint="default" w:ascii="Times New Roman" w:hAnsi="Times New Roman" w:cs="Times New Roman"/>
+          <w:sz w:val="26"/>
+          <w:szCs w:val="26"/>
+          <w:lang w:val="en-US"/>
+        </w:rPr>
+        <w:fldChar w:fldCharType="end"/>
       </w:r>
     </w:p>
     <w:p>

</xml_diff>